<commit_message>
feat: update PDF conversion message for batch processing
</commit_message>
<xml_diff>
--- a/template/00. Template Lampiran SPK PPL.docx
+++ b/template/00. Template Lampiran SPK PPL.docx
@@ -114,7 +114,6 @@
       </w:pPr>
       <w:r>
         <w:rPr>
-          <w:color w:val="FF0000"/>
           <w:sz w:val="24"/>
           <w:szCs w:val="24"/>
         </w:rPr>
@@ -1047,6 +1046,7 @@
             </w:pPr>
             <w:r>
               <w:rPr>
+                <w:color w:val="EE0000"/>
                 <w:sz w:val="24"/>
                 <w:szCs w:val="24"/>
               </w:rPr>
@@ -1055,6 +1055,7 @@
             <w:proofErr w:type="spellStart"/>
             <w:r>
               <w:rPr>
+                <w:color w:val="EE0000"/>
                 <w:sz w:val="24"/>
                 <w:szCs w:val="24"/>
               </w:rPr>
@@ -1063,10 +1064,18 @@
             <w:proofErr w:type="spellEnd"/>
             <w:r>
               <w:rPr>
-                <w:sz w:val="24"/>
-                <w:szCs w:val="24"/>
-              </w:rPr>
-              <w:t>}} SLS/sub-SLS</w:t>
+                <w:color w:val="EE0000"/>
+                <w:sz w:val="24"/>
+                <w:szCs w:val="24"/>
+              </w:rPr>
+              <w:t>}}</w:t>
+            </w:r>
+            <w:r>
+              <w:rPr>
+                <w:sz w:val="24"/>
+                <w:szCs w:val="24"/>
+              </w:rPr>
+              <w:t xml:space="preserve"> SLS/sub-SLS</w:t>
             </w:r>
           </w:p>
         </w:tc>
@@ -1091,7 +1100,7 @@
               </w:pBdr>
               <w:spacing w:before="44"/>
               <w:rPr>
-                <w:color w:val="000000"/>
+                <w:color w:val="1F497D" w:themeColor="text2"/>
                 <w:sz w:val="24"/>
                 <w:szCs w:val="24"/>
               </w:rPr>
@@ -1112,14 +1121,14 @@
               <w:ind w:left="20"/>
               <w:jc w:val="center"/>
               <w:rPr>
-                <w:color w:val="FF0000"/>
-                <w:sz w:val="24"/>
-                <w:szCs w:val="24"/>
-              </w:rPr>
-            </w:pPr>
-            <w:r>
-              <w:rPr>
-                <w:color w:val="FF0000"/>
+                <w:color w:val="1F497D" w:themeColor="text2"/>
+                <w:sz w:val="24"/>
+                <w:szCs w:val="24"/>
+              </w:rPr>
+            </w:pPr>
+            <w:r>
+              <w:rPr>
+                <w:color w:val="1F497D" w:themeColor="text2"/>
                 <w:sz w:val="24"/>
                 <w:szCs w:val="24"/>
               </w:rPr>
@@ -1128,7 +1137,7 @@
             <w:r>
               <w:rPr>
                 <w:rFonts w:ascii="Times New Roman" w:eastAsia="Times New Roman" w:hAnsi="Times New Roman" w:cs="Times New Roman"/>
-                <w:color w:val="FF0000"/>
+                <w:color w:val="1F497D" w:themeColor="text2"/>
                 <w:sz w:val="24"/>
                 <w:szCs w:val="24"/>
               </w:rPr>
@@ -1136,7 +1145,7 @@
             </w:r>
             <w:r>
               <w:rPr>
-                <w:color w:val="FF0000"/>
+                <w:color w:val="1F497D" w:themeColor="text2"/>
                 <w:sz w:val="24"/>
                 <w:szCs w:val="24"/>
               </w:rPr>
@@ -1391,11 +1400,20 @@
                 <w:sz w:val="24"/>
                 <w:szCs w:val="24"/>
               </w:rPr>
-              <w:t>Seluruh {{</w:t>
+              <w:t xml:space="preserve">Seluruh </w:t>
+            </w:r>
+            <w:r>
+              <w:rPr>
+                <w:color w:val="EE0000"/>
+                <w:sz w:val="24"/>
+                <w:szCs w:val="24"/>
+              </w:rPr>
+              <w:t>{{</w:t>
             </w:r>
             <w:proofErr w:type="spellStart"/>
             <w:r>
               <w:rPr>
+                <w:color w:val="EE0000"/>
                 <w:sz w:val="24"/>
                 <w:szCs w:val="24"/>
               </w:rPr>
@@ -1404,10 +1422,18 @@
             <w:proofErr w:type="spellEnd"/>
             <w:r>
               <w:rPr>
-                <w:sz w:val="24"/>
-                <w:szCs w:val="24"/>
-              </w:rPr>
-              <w:t>}} SLS/sub-SLS</w:t>
+                <w:color w:val="EE0000"/>
+                <w:sz w:val="24"/>
+                <w:szCs w:val="24"/>
+              </w:rPr>
+              <w:t>}}</w:t>
+            </w:r>
+            <w:r>
+              <w:rPr>
+                <w:sz w:val="24"/>
+                <w:szCs w:val="24"/>
+              </w:rPr>
+              <w:t xml:space="preserve"> SLS/sub-SLS</w:t>
             </w:r>
           </w:p>
         </w:tc>
@@ -1435,7 +1461,7 @@
               </w:tabs>
               <w:jc w:val="center"/>
               <w:rPr>
-                <w:color w:val="000000"/>
+                <w:color w:val="1F497D" w:themeColor="text2"/>
               </w:rPr>
             </w:pPr>
           </w:p>
@@ -1453,14 +1479,14 @@
               </w:tabs>
               <w:jc w:val="center"/>
               <w:rPr>
-                <w:color w:val="FF0000"/>
-                <w:sz w:val="24"/>
-                <w:szCs w:val="24"/>
-              </w:rPr>
-            </w:pPr>
-            <w:r>
-              <w:rPr>
-                <w:color w:val="FF0000"/>
+                <w:color w:val="1F497D" w:themeColor="text2"/>
+                <w:sz w:val="24"/>
+                <w:szCs w:val="24"/>
+              </w:rPr>
+            </w:pPr>
+            <w:r>
+              <w:rPr>
+                <w:color w:val="1F497D" w:themeColor="text2"/>
                 <w:sz w:val="24"/>
                 <w:szCs w:val="24"/>
               </w:rPr>
@@ -1654,7 +1680,7 @@
               </w:pBdr>
               <w:jc w:val="center"/>
               <w:rPr>
-                <w:color w:val="000000"/>
+                <w:color w:val="1F497D" w:themeColor="text2"/>
                 <w:sz w:val="24"/>
                 <w:szCs w:val="24"/>
               </w:rPr>
@@ -1672,7 +1698,7 @@
               <w:spacing w:before="53"/>
               <w:jc w:val="center"/>
               <w:rPr>
-                <w:color w:val="000000"/>
+                <w:color w:val="1F497D" w:themeColor="text2"/>
                 <w:sz w:val="24"/>
                 <w:szCs w:val="24"/>
               </w:rPr>
@@ -1692,14 +1718,14 @@
               </w:tabs>
               <w:jc w:val="center"/>
               <w:rPr>
-                <w:color w:val="FF0000"/>
-                <w:sz w:val="24"/>
-                <w:szCs w:val="24"/>
-              </w:rPr>
-            </w:pPr>
-            <w:r>
-              <w:rPr>
-                <w:color w:val="FF0000"/>
+                <w:color w:val="1F497D" w:themeColor="text2"/>
+                <w:sz w:val="24"/>
+                <w:szCs w:val="24"/>
+              </w:rPr>
+            </w:pPr>
+            <w:r>
+              <w:rPr>
+                <w:color w:val="1F497D" w:themeColor="text2"/>
                 <w:sz w:val="24"/>
                 <w:szCs w:val="24"/>
               </w:rPr>

</xml_diff>